<commit_message>
docs(cidadao-app): autorização deixa claro que o app é da AutoMais
A versão anterior tratava o app como da Secretaria: "o aplicativo é desta Secretaria" (item 2),
publicação "em conta do Município" (item 1) e, na revogação, retirada das lojas ou transferência para
a conta indicada pela Secretaria (item 6). O app é de propriedade da AutoMais; o que a Secretaria
autoriza é publicá-lo em nome dela e usar o nome e a marca da Prefeitura.

- item 1: "de propriedade da AUTOMAIS", na conta de desenvolvedor da AUTOMAIS;
- item 2: oferecido aos cidadãos "como serviço desta Secretaria";
- item 4: a AUTOMAIS é a proprietária e a responsável técnica;
- item 6: revogada, a AUTOMAIS deixa de usar o nome e a marca em até 30 dias — sem transferência;
- README da pasta explica propriedade e revogação.

Declaração continua com 1 página e o ofício com 2 (contado no Word).

Co-Authored-By: Claude Opus 5.5 <noreply@anthropic.com>
</commit_message>
<xml_diff>
--- a/docs/publicacao-lojas/declaracao-autorizacao-app-saude-marica.docx
+++ b/docs/publicacao-lojas/declaracao-autorizacao-app-saude-marica.docx
@@ -41,7 +41,7 @@
         <w:t xml:space="preserve">O MUNICÍPIO DE MARICÁ, pessoa jurídica de direito público interno, inscrito no CNPJ sob o nº 29.131.075/0001-93, por meio da SECRETARIA MUNICIPAL DE SAÚDE, declara, para os devidos fins, que autoriza</w:t>
       </w:r>
       <w:r>
-        <w:t xml:space="preserve"> a AUTOMAIS COMÉRCIO E SERVIÇOS DE AUTOMAÇÃO LTDA, inscrita no CNPJ sob o nº 17.920.822/0001-93, com sede na Rua do Amparo, nº 809 – A – PARTE, Cascadura, Rio de Janeiro/RJ, CEP 21.381-340, a desenvolver, publicar, manter e atualizar, em nome desta Secretaria, o aplicativo “Saúde Maricá”, identificado pelo nome de pacote io.automais.smsmais.cidadao, nas lojas de aplicativos Google Play, do Google, e App Store, da Apple. A publicação pode ser feita na conta de desenvolvedor da AUTOMAIS ou em conta do Município.</w:t>
+        <w:t xml:space="preserve"> a AUTOMAIS COMÉRCIO E SERVIÇOS DE AUTOMAÇÃO LTDA, inscrita no CNPJ sob o nº 17.920.822/0001-93, com sede na Rua do Amparo, nº 809 – A – PARTE, Cascadura, Rio de Janeiro/RJ, CEP 21.381-340, a desenvolver, publicar, manter e atualizar, em nome desta Secretaria, o aplicativo “Saúde Maricá”, de propriedade da AUTOMAIS, identificado pelo nome de pacote io.automais.smsmais.cidadao, nas lojas de aplicativos Google Play, do Google, e App Store, da Apple, na conta de desenvolvedor da AUTOMAIS.</w:t>
       </w:r>
     </w:p>
     <w:p>
@@ -55,7 +55,7 @@
         <w:jc w:val="both"/>
       </w:pPr>
       <w:r>
-        <w:t xml:space="preserve">O aplicativo é desta Secretaria e se destina aos cidadãos atendidos pela rede municipal de saúde, para consulta de agendamentos de consultas e exames, de resultados e laudos de exames, de documentos de atendimento e do transporte para tratamento.</w:t>
+        <w:t xml:space="preserve">O aplicativo é oferecido aos cidadãos atendidos pela rede municipal de saúde como serviço desta Secretaria, para consulta de agendamentos de consultas e exames, de resultados e laudos de exames, de documentos de atendimento e do transporte para tratamento.</w:t>
       </w:r>
     </w:p>
     <w:p>
@@ -83,7 +83,7 @@
         <w:jc w:val="both"/>
       </w:pPr>
       <w:r>
-        <w:t xml:space="preserve">A AUTOMAIS presta serviços de tecnologia da informação a esta Secretaria e é a responsável técnica pelo aplicativo. O contato oficial do aplicativo é dev@automais.com.</w:t>
+        <w:t xml:space="preserve">A AUTOMAIS presta serviços de tecnologia da informação a esta Secretaria e é a proprietária e a responsável técnica pelo aplicativo. O contato oficial do aplicativo é dev@automais.com.</w:t>
       </w:r>
     </w:p>
     <w:p>
@@ -143,7 +143,7 @@
         <w:jc w:val="both"/>
       </w:pPr>
       <w:r>
-        <w:t xml:space="preserve">Esta autorização vale a partir da data de assinatura, enquanto a AUTOMAIS prestar serviços a esta Secretaria, e pode ser revogada a qualquer tempo, por comunicação escrita. Revogada a autorização, a AUTOMAIS deverá, em até 30 (trinta) dias, retirar o aplicativo das lojas ou transferi-lo para a conta de desenvolvedor indicada por esta Secretaria.</w:t>
+        <w:t xml:space="preserve">Esta autorização vale a partir da data de assinatura, enquanto a AUTOMAIS prestar serviços a esta Secretaria, e pode ser revogada a qualquer tempo, por comunicação escrita. Revogada a autorização, a AUTOMAIS deverá, em até 30 (trinta) dias, deixar de usar o nome “Saúde Maricá” e a marca da Prefeitura de Maricá no aplicativo e nas páginas dele nas lojas, e de apresentá-lo como serviço desta Secretaria.</w:t>
       </w:r>
     </w:p>
     <w:p>

</xml_diff>